<commit_message>
실제 검사시간(Result_Time_Data.csv) 반영해 Tact_sec 채움
Run Id별 Finish−Start를 실제 검사시간으로 계산해 DOE 엑셀 Tact_sec 갱신
(기존 이미지 타임스탬프 근사 → 작업 전체 소요시간으로 대체).

- 실험데이터/Result_Time_Data.csv 업로드
- 38런 Tact_sec 채움(D26-04는 2런 3708/3712 평균), Recipe Id로 매칭
- Word 보고서 §4에 Result_Time_Data.csv 추가, §5 Tact_sec 출처 정정

Co-Authored-By: Claude Opus 4.8 <noreply@anthropic.com>
Claude-Session: https://claude.ai/code/session_01AEDPo1aa2m4Ui6JuqiXEbY
</commit_message>
<xml_diff>
--- a/실험데이터/공정모델링_DOE_2anchor_3anchor_Fmin32_측정직경모델/Xray_DOE_공정모델링_데이터정의_보고서.docx
+++ b/실험데이터/공정모델링_DOE_2anchor_3anchor_Fmin32_측정직경모델/Xray_DOE_공정모델링_데이터정의_보고서.docx
@@ -4976,6 +4976,48 @@
           </w:p>
         </w:tc>
       </w:tr>
+      <w:tr>
+        <w:tc>
+          <w:tcPr>
+            <w:tcW w:type="dxa" w:w="2592"/>
+          </w:tcPr>
+          <w:p>
+            <w:r>
+              <w:t>2e</w:t>
+            </w:r>
+          </w:p>
+        </w:tc>
+        <w:tc>
+          <w:tcPr>
+            <w:tcW w:type="dxa" w:w="2592"/>
+          </w:tcPr>
+          <w:p>
+            <w:r>
+              <w:t>Result_Time_Data.csv</w:t>
+            </w:r>
+          </w:p>
+        </w:tc>
+        <w:tc>
+          <w:tcPr>
+            <w:tcW w:type="dxa" w:w="2592"/>
+          </w:tcPr>
+          <w:p>
+            <w:r>
+              <w:t>Run Id별 Start/Finish Time + Recipe Id(=Global_Run_ID)</w:t>
+            </w:r>
+          </w:p>
+        </w:tc>
+        <w:tc>
+          <w:tcPr>
+            <w:tcW w:type="dxa" w:w="2592"/>
+          </w:tcPr>
+          <w:p>
+            <w:r>
+              <w:t>Tact_sec = Finish−Start (실제 검사시간, 권장). 파일명 타임스탬프보다 정확</w:t>
+            </w:r>
+          </w:p>
+        </w:tc>
+      </w:tr>
     </w:tbl>
     <w:p>
       <w:pPr>
@@ -6407,7 +6449,7 @@
           </w:tcPr>
           <w:p>
             <w:r>
-              <w:t>자동(Image_File_List)</w:t>
+              <w:t>자동(Result_Time_Data.csv)</w:t>
             </w:r>
           </w:p>
         </w:tc>
@@ -6424,7 +6466,7 @@
           </w:tcPr>
           <w:p>
             <w:r>
-              <w:t>Images/Image_File_List 파일명 타임스탬프의 (마지막−처음) 초. die 이미지 촬영 구간</w:t>
+              <w:t>Run Id별 (Finish Time − Start Time) 초. Recipe Id로 Global_Run_ID 매칭</w:t>
             </w:r>
           </w:p>
         </w:tc>

</xml_diff>